<commit_message>
Sync markdown and docx with the tex; refresh preview PDF
The last round of edits (IOP author block, e-prop related work and citation) had gone only into the .tex, leaving the .md and .docx behind. All three artifacts now carry identical content, and the stubbed preview PDF is regenerated.
</commit_message>
<xml_diff>
--- a/research/paper/manuscript_nce.docx
+++ b/research/paper/manuscript_nce.docx
@@ -22,7 +22,7 @@
         <w:t>Authors:</w:t>
       </w:r>
       <w:r>
-        <w:t xml:space="preserve"> [AUTHOR NAME(S)]</w:t>
+        <w:t xml:space="preserve"> [FIRST AUTHOR]^1,*^, [SECOND AUTHOR]^2^ and [THIRD AUTHOR]^1^</w:t>
       </w:r>
     </w:p>
     <w:p>
@@ -30,13 +30,7 @@
         <w:spacing w:after="120"/>
       </w:pPr>
       <w:r>
-        <w:rPr>
-          <w:b/>
-        </w:rPr>
-        <w:t>Affiliation:</w:t>
-      </w:r>
-      <w:r>
-        <w:t xml:space="preserve"> [AFFILIATION]</w:t>
+        <w:t>^1^ [DEPARTMENT, INSTITUTION, CITY, COUNTRY]</w:t>
       </w:r>
     </w:p>
     <w:p>
@@ -44,13 +38,40 @@
         <w:spacing w:after="120"/>
       </w:pPr>
       <w:r>
+        <w:t>^2^ [SECOND INSTITUTION, CITY, COUNTRY]</w:t>
+      </w:r>
+    </w:p>
+    <w:p>
+      <w:pPr>
+        <w:spacing w:after="120"/>
+      </w:pPr>
+      <w:r>
+        <w:t>^*^ Author to whom any correspondence should be addressed.</w:t>
+      </w:r>
+    </w:p>
+    <w:p>
+      <w:pPr>
+        <w:spacing w:after="120"/>
+      </w:pPr>
+      <w:r>
         <w:rPr>
           <w:b/>
         </w:rPr>
-        <w:t>Corresponding author:</w:t>
-      </w:r>
-      <w:r>
-        <w:t xml:space="preserve"> [EMAIL]</w:t>
+        <w:t>E-mail:</w:t>
+      </w:r>
+      <w:r>
+        <w:t xml:space="preserve"> [CORRESPONDING EMAIL]</w:t>
+      </w:r>
+    </w:p>
+    <w:p>
+      <w:pPr>
+        <w:spacing w:after="120"/>
+      </w:pPr>
+      <w:r>
+        <w:rPr>
+          <w:i/>
+        </w:rPr>
+        <w:t>Note: NCE displays ORCID iDs; supply one per author at submission.</w:t>
       </w:r>
     </w:p>
     <w:p>
@@ -520,6 +541,29 @@
       </w:r>
       <w:r>
         <w:t>. We find they also make networks certifiable without a dedicated objective, which to our knowledge has not been reported.</w:t>
+      </w:r>
+    </w:p>
+    <w:p>
+      <w:pPr>
+        <w:spacing w:after="120"/>
+      </w:pPr>
+      <w:r>
+        <w:rPr>
+          <w:b/>
+        </w:rPr>
+        <w:t>Event-driven reformulation of sparse spiking workloads.</w:t>
+      </w:r>
+      <w:r>
+        <w:t xml:space="preserve"> A complementary line of work rewrites time-driven spiking computations in event-driven form, so that work scales with activity rather than with time steps; a recent example reformulates eligibility propagation this way and reports exact reductions in computation for sparse networks, with a reference implementation in NEST [16]. That approach reduces the work done </w:t>
+      </w:r>
+      <w:r>
+        <w:rPr>
+          <w:i/>
+        </w:rPr>
+        <w:t>given</w:t>
+      </w:r>
+      <w:r>
+        <w:t xml:space="preserve"> the dependency structure; ours changes the dependency structure itself, by making a neighbour's silence provable so that the dependency need not be waited on at all. The two are orthogonal and could compose.</w:t>
       </w:r>
     </w:p>
     <w:p>
@@ -7546,6 +7590,32 @@
       </w:r>
       <w:r>
         <w:t xml:space="preserve"> (2018).</w:t>
+      </w:r>
+    </w:p>
+    <w:p>
+      <w:pPr>
+        <w:spacing w:after="60"/>
+      </w:pPr>
+      <w:r>
+        <w:t xml:space="preserve">[16] A Korcsak-Gorzo, J A Espinoza-Valverde, J Stapmanns, H E Plesser, D Dahmen, M Bolten, S J van Albada and M Diesmann, "Event-driven eligibility propagation in large sparse networks", </w:t>
+      </w:r>
+      <w:r>
+        <w:rPr>
+          <w:i/>
+        </w:rPr>
+        <w:t>Neuromorph. Comput. Eng.</w:t>
+      </w:r>
+      <w:r>
+        <w:t xml:space="preserve"> </w:t>
+      </w:r>
+      <w:r>
+        <w:rPr>
+          <w:b/>
+        </w:rPr>
+        <w:t>6</w:t>
+      </w:r>
+      <w:r>
+        <w:t xml:space="preserve"> 034024 (2026).</w:t>
       </w:r>
     </w:p>
     <w:p>

</xml_diff>